<commit_message>
Update server.js, App.jsx, vorlage.docx and add extract_pdf.py
</commit_message>
<xml_diff>
--- a/data/vorlage.docx
+++ b/data/vorlage.docx
@@ -4,7 +4,7 @@
   <w:body>
     <w:p>
       <w:pPr>
-        <w:pStyle w:val="KeinLeerraum"/>
+        <w:pStyle w:val="NoSpacing"/>
         <w:rPr>
           <w:rFonts w:ascii="Arial" w:hAnsi="Arial" w:cs="Arial"/>
           <w:sz w:val="20"/>
@@ -15,7 +15,7 @@
     </w:p>
     <w:p>
       <w:pPr>
-        <w:pStyle w:val="KeinLeerraum"/>
+        <w:pStyle w:val="NoSpacing"/>
         <w:tabs>
           <w:tab w:val="left" w:pos="3136"/>
         </w:tabs>
@@ -28,7 +28,7 @@
     </w:p>
     <w:p>
       <w:pPr>
-        <w:pStyle w:val="KeinLeerraum"/>
+        <w:pStyle w:val="NoSpacing"/>
         <w:tabs>
           <w:tab w:val="left" w:pos="7201"/>
         </w:tabs>
@@ -44,7 +44,7 @@
     </w:p>
     <w:p>
       <w:pPr>
-        <w:pStyle w:val="KeinLeerraum"/>
+        <w:pStyle w:val="NoSpacing"/>
         <w:tabs>
           <w:tab w:val="left" w:pos="7201"/>
         </w:tabs>
@@ -59,7 +59,7 @@
     </w:p>
     <w:p>
       <w:pPr>
-        <w:pStyle w:val="KeinLeerraum"/>
+        <w:pStyle w:val="NoSpacing"/>
         <w:spacing w:line="259" w:lineRule="auto"/>
         <w:rPr>
           <w:rFonts w:ascii="Arial" w:hAnsi="Arial" w:cs="Arial"/>
@@ -86,7 +86,7 @@
     </w:p>
     <w:p>
       <w:pPr>
-        <w:pStyle w:val="KeinLeerraum"/>
+        <w:pStyle w:val="NoSpacing"/>
         <w:spacing w:line="259" w:lineRule="auto"/>
         <w:rPr>
           <w:rFonts w:ascii="Arial" w:hAnsi="Arial" w:cs="Arial"/>
@@ -131,7 +131,7 @@
     </w:p>
     <w:p>
       <w:pPr>
-        <w:pStyle w:val="Textkrper2"/>
+        <w:pStyle w:val="BodyText2"/>
         <w:spacing w:line="20" w:lineRule="atLeast"/>
         <w:jc w:val="right"/>
         <w:rPr>
@@ -184,7 +184,7 @@
           <w:szCs w:val="20"/>
           <w:lang w:eastAsia="de-DE"/>
         </w:rPr>
-        <w:t>4. Juni 2025</w:t>
+        <w:t>25. Februar 2026</w:t>
       </w:r>
       <w:r>
         <w:rPr>
@@ -200,29 +200,29 @@
     </w:p>
     <w:p>
       <w:pPr>
-        <w:pStyle w:val="Textkrper2"/>
-        <w:rPr>
-          <w:rFonts w:ascii="Arial" w:hAnsi="Arial" w:cs="Arial"/>
-          <w:color w:val="000000" w:themeColor="text1"/>
-          <w:sz w:val="20"/>
-          <w:szCs w:val="20"/>
-        </w:rPr>
-      </w:pPr>
-    </w:p>
-    <w:p>
-      <w:pPr>
-        <w:pStyle w:val="Textkrper2"/>
-        <w:rPr>
-          <w:rFonts w:ascii="Arial" w:hAnsi="Arial" w:cs="Arial"/>
-          <w:color w:val="000000" w:themeColor="text1"/>
-          <w:sz w:val="20"/>
-          <w:szCs w:val="20"/>
-        </w:rPr>
-      </w:pPr>
-    </w:p>
-    <w:p>
-      <w:pPr>
-        <w:pStyle w:val="Textkrper2"/>
+        <w:pStyle w:val="BodyText2"/>
+        <w:rPr>
+          <w:rFonts w:ascii="Arial" w:hAnsi="Arial" w:cs="Arial"/>
+          <w:color w:val="000000" w:themeColor="text1"/>
+          <w:sz w:val="20"/>
+          <w:szCs w:val="20"/>
+        </w:rPr>
+      </w:pPr>
+    </w:p>
+    <w:p>
+      <w:pPr>
+        <w:pStyle w:val="BodyText2"/>
+        <w:rPr>
+          <w:rFonts w:ascii="Arial" w:hAnsi="Arial" w:cs="Arial"/>
+          <w:color w:val="000000" w:themeColor="text1"/>
+          <w:sz w:val="20"/>
+          <w:szCs w:val="20"/>
+        </w:rPr>
+      </w:pPr>
+    </w:p>
+    <w:p>
+      <w:pPr>
+        <w:pStyle w:val="BodyText2"/>
         <w:rPr>
           <w:rFonts w:ascii="Arial" w:hAnsi="Arial" w:cs="Arial"/>
           <w:b/>
@@ -257,7 +257,7 @@
     </w:p>
     <w:p>
       <w:pPr>
-        <w:pStyle w:val="Textkrper2"/>
+        <w:pStyle w:val="BodyText2"/>
         <w:tabs>
           <w:tab w:val="left" w:pos="753"/>
         </w:tabs>
@@ -290,7 +290,7 @@
     </w:p>
     <w:p>
       <w:pPr>
-        <w:pStyle w:val="Textkrper2"/>
+        <w:pStyle w:val="BodyText2"/>
         <w:spacing w:line="20" w:lineRule="atLeast"/>
         <w:rPr>
           <w:rFonts w:ascii="Arial" w:hAnsi="Arial" w:cs="Arial"/>
@@ -320,7 +320,7 @@
     </w:p>
     <w:p>
       <w:pPr>
-        <w:pStyle w:val="Textkrper2"/>
+        <w:pStyle w:val="BodyText2"/>
         <w:spacing w:line="20" w:lineRule="atLeast"/>
         <w:rPr>
           <w:rFonts w:ascii="Arial" w:hAnsi="Arial" w:cs="Arial"/>
@@ -359,7 +359,7 @@
     </w:p>
     <w:p>
       <w:pPr>
-        <w:pStyle w:val="Textkrper2"/>
+        <w:pStyle w:val="BodyText2"/>
         <w:rPr>
           <w:rFonts w:ascii="Arial" w:hAnsi="Arial" w:cs="Arial"/>
           <w:color w:val="000000" w:themeColor="text1"/>
@@ -405,18 +405,18 @@
     </w:p>
     <w:p>
       <w:pPr>
-        <w:pStyle w:val="Textkrper2"/>
-        <w:rPr>
-          <w:rFonts w:ascii="Arial" w:hAnsi="Arial" w:cs="Arial"/>
-          <w:color w:val="000000" w:themeColor="text1"/>
-          <w:sz w:val="20"/>
-          <w:szCs w:val="20"/>
-        </w:rPr>
-      </w:pPr>
-    </w:p>
-    <w:p>
-      <w:pPr>
-        <w:pStyle w:val="Textkrper2"/>
+        <w:pStyle w:val="BodyText2"/>
+        <w:rPr>
+          <w:rFonts w:ascii="Arial" w:hAnsi="Arial" w:cs="Arial"/>
+          <w:color w:val="000000" w:themeColor="text1"/>
+          <w:sz w:val="20"/>
+          <w:szCs w:val="20"/>
+        </w:rPr>
+      </w:pPr>
+    </w:p>
+    <w:p>
+      <w:pPr>
+        <w:pStyle w:val="BodyText2"/>
         <w:rPr>
           <w:rFonts w:ascii="Arial" w:hAnsi="Arial" w:cs="Arial"/>
           <w:color w:val="000000" w:themeColor="text1"/>
@@ -438,7 +438,7 @@
     <w:bookmarkEnd w:id="1"/>
     <w:p>
       <w:pPr>
-        <w:pStyle w:val="Textkrper2"/>
+        <w:pStyle w:val="BodyText2"/>
         <w:rPr>
           <w:rFonts w:ascii="Arial" w:hAnsi="Arial" w:cs="Arial"/>
           <w:b/>
@@ -451,7 +451,7 @@
     </w:p>
     <w:p>
       <w:pPr>
-        <w:pStyle w:val="Textkrper2"/>
+        <w:pStyle w:val="BodyText2"/>
         <w:rPr>
           <w:rFonts w:ascii="Arial" w:hAnsi="Arial" w:cs="Arial"/>
           <w:b/>
@@ -464,7 +464,7 @@
     </w:p>
     <w:p>
       <w:pPr>
-        <w:pStyle w:val="Textkrper2"/>
+        <w:pStyle w:val="BodyText2"/>
         <w:rPr>
           <w:rFonts w:ascii="Arial" w:hAnsi="Arial" w:cs="Arial"/>
           <w:b/>
@@ -509,7 +509,7 @@
     </w:p>
     <w:p>
       <w:pPr>
-        <w:pStyle w:val="Textkrper2"/>
+        <w:pStyle w:val="BodyText2"/>
         <w:tabs>
           <w:tab w:val="left" w:pos="753"/>
         </w:tabs>
@@ -542,7 +542,7 @@
     </w:p>
     <w:p>
       <w:pPr>
-        <w:pStyle w:val="Textkrper2"/>
+        <w:pStyle w:val="BodyText2"/>
         <w:spacing w:line="20" w:lineRule="atLeast"/>
         <w:rPr>
           <w:rFonts w:ascii="Arial" w:hAnsi="Arial" w:cs="Arial"/>
@@ -572,7 +572,7 @@
     </w:p>
     <w:p>
       <w:pPr>
-        <w:pStyle w:val="Textkrper2"/>
+        <w:pStyle w:val="BodyText2"/>
         <w:spacing w:line="20" w:lineRule="atLeast"/>
         <w:rPr>
           <w:rFonts w:ascii="Arial" w:hAnsi="Arial" w:cs="Arial"/>
@@ -601,7 +601,7 @@
     </w:p>
     <w:p>
       <w:pPr>
-        <w:pStyle w:val="Textkrper2"/>
+        <w:pStyle w:val="BodyText2"/>
         <w:rPr>
           <w:rFonts w:ascii="Arial" w:hAnsi="Arial" w:cs="Arial"/>
           <w:color w:val="000000" w:themeColor="text1"/>
@@ -647,18 +647,18 @@
     </w:p>
     <w:p>
       <w:pPr>
-        <w:pStyle w:val="Textkrper2"/>
-        <w:rPr>
-          <w:rFonts w:ascii="Arial" w:hAnsi="Arial" w:cs="Arial"/>
-          <w:color w:val="000000" w:themeColor="text1"/>
-          <w:sz w:val="20"/>
-          <w:szCs w:val="20"/>
-        </w:rPr>
-      </w:pPr>
-    </w:p>
-    <w:p>
-      <w:pPr>
-        <w:pStyle w:val="Textkrper2"/>
+        <w:pStyle w:val="BodyText2"/>
+        <w:rPr>
+          <w:rFonts w:ascii="Arial" w:hAnsi="Arial" w:cs="Arial"/>
+          <w:color w:val="000000" w:themeColor="text1"/>
+          <w:sz w:val="20"/>
+          <w:szCs w:val="20"/>
+        </w:rPr>
+      </w:pPr>
+    </w:p>
+    <w:p>
+      <w:pPr>
+        <w:pStyle w:val="BodyText2"/>
         <w:rPr>
           <w:rFonts w:ascii="Arial" w:hAnsi="Arial" w:cs="Arial"/>
           <w:color w:val="000000" w:themeColor="text1"/>
@@ -678,18 +678,18 @@
     </w:p>
     <w:p>
       <w:pPr>
-        <w:pStyle w:val="Textkrper2"/>
-        <w:rPr>
-          <w:rFonts w:ascii="Arial" w:hAnsi="Arial" w:cs="Arial"/>
-          <w:color w:val="000000" w:themeColor="text1"/>
-          <w:sz w:val="20"/>
-          <w:szCs w:val="20"/>
-        </w:rPr>
-      </w:pPr>
-    </w:p>
-    <w:p>
-      <w:pPr>
-        <w:pStyle w:val="Textkrper2"/>
+        <w:pStyle w:val="BodyText2"/>
+        <w:rPr>
+          <w:rFonts w:ascii="Arial" w:hAnsi="Arial" w:cs="Arial"/>
+          <w:color w:val="000000" w:themeColor="text1"/>
+          <w:sz w:val="20"/>
+          <w:szCs w:val="20"/>
+        </w:rPr>
+      </w:pPr>
+    </w:p>
+    <w:p>
+      <w:pPr>
+        <w:pStyle w:val="BodyText2"/>
         <w:rPr>
           <w:rFonts w:ascii="Arial" w:hAnsi="Arial" w:cs="Arial"/>
           <w:b/>
@@ -702,7 +702,7 @@
     </w:p>
     <w:p>
       <w:pPr>
-        <w:pStyle w:val="Textkrper2"/>
+        <w:pStyle w:val="BodyText2"/>
         <w:rPr>
           <w:rFonts w:ascii="Arial" w:hAnsi="Arial" w:cs="Arial"/>
           <w:b/>
@@ -747,7 +747,7 @@
     </w:p>
     <w:p>
       <w:pPr>
-        <w:pStyle w:val="Textkrper2"/>
+        <w:pStyle w:val="BodyText2"/>
         <w:tabs>
           <w:tab w:val="left" w:pos="753"/>
         </w:tabs>
@@ -780,7 +780,7 @@
     </w:p>
     <w:p>
       <w:pPr>
-        <w:pStyle w:val="Textkrper2"/>
+        <w:pStyle w:val="BodyText2"/>
         <w:spacing w:line="20" w:lineRule="atLeast"/>
         <w:rPr>
           <w:rFonts w:ascii="Arial" w:hAnsi="Arial" w:cs="Arial"/>
@@ -810,7 +810,7 @@
     </w:p>
     <w:p>
       <w:pPr>
-        <w:pStyle w:val="Textkrper2"/>
+        <w:pStyle w:val="BodyText2"/>
         <w:spacing w:line="20" w:lineRule="atLeast"/>
         <w:rPr>
           <w:rFonts w:ascii="Arial" w:hAnsi="Arial" w:cs="Arial"/>
@@ -839,7 +839,7 @@
     </w:p>
     <w:p>
       <w:pPr>
-        <w:pStyle w:val="Textkrper2"/>
+        <w:pStyle w:val="BodyText2"/>
         <w:rPr>
           <w:rFonts w:ascii="Arial" w:hAnsi="Arial" w:cs="Arial"/>
           <w:color w:val="000000" w:themeColor="text1"/>
@@ -885,18 +885,18 @@
     </w:p>
     <w:p>
       <w:pPr>
-        <w:pStyle w:val="Textkrper2"/>
-        <w:rPr>
-          <w:rFonts w:ascii="Arial" w:hAnsi="Arial" w:cs="Arial"/>
-          <w:color w:val="000000" w:themeColor="text1"/>
-          <w:sz w:val="20"/>
-          <w:szCs w:val="20"/>
-        </w:rPr>
-      </w:pPr>
-    </w:p>
-    <w:p>
-      <w:pPr>
-        <w:pStyle w:val="Textkrper2"/>
+        <w:pStyle w:val="BodyText2"/>
+        <w:rPr>
+          <w:rFonts w:ascii="Arial" w:hAnsi="Arial" w:cs="Arial"/>
+          <w:color w:val="000000" w:themeColor="text1"/>
+          <w:sz w:val="20"/>
+          <w:szCs w:val="20"/>
+        </w:rPr>
+      </w:pPr>
+    </w:p>
+    <w:p>
+      <w:pPr>
+        <w:pStyle w:val="BodyText2"/>
         <w:rPr>
           <w:rFonts w:ascii="Arial" w:hAnsi="Arial" w:cs="Arial"/>
           <w:color w:val="000000" w:themeColor="text1"/>
@@ -916,29 +916,29 @@
     </w:p>
     <w:p>
       <w:pPr>
-        <w:pStyle w:val="Textkrper2"/>
-        <w:rPr>
-          <w:rFonts w:ascii="Arial" w:hAnsi="Arial" w:cs="Arial"/>
-          <w:color w:val="000000" w:themeColor="text1"/>
-          <w:sz w:val="20"/>
-          <w:szCs w:val="20"/>
-        </w:rPr>
-      </w:pPr>
-    </w:p>
-    <w:p>
-      <w:pPr>
-        <w:pStyle w:val="Textkrper2"/>
-        <w:rPr>
-          <w:rFonts w:ascii="Arial" w:hAnsi="Arial" w:cs="Arial"/>
-          <w:color w:val="000000" w:themeColor="text1"/>
-          <w:sz w:val="20"/>
-          <w:szCs w:val="20"/>
-        </w:rPr>
-      </w:pPr>
-    </w:p>
-    <w:p>
-      <w:pPr>
-        <w:pStyle w:val="Textkrper2"/>
+        <w:pStyle w:val="BodyText2"/>
+        <w:rPr>
+          <w:rFonts w:ascii="Arial" w:hAnsi="Arial" w:cs="Arial"/>
+          <w:color w:val="000000" w:themeColor="text1"/>
+          <w:sz w:val="20"/>
+          <w:szCs w:val="20"/>
+        </w:rPr>
+      </w:pPr>
+    </w:p>
+    <w:p>
+      <w:pPr>
+        <w:pStyle w:val="BodyText2"/>
+        <w:rPr>
+          <w:rFonts w:ascii="Arial" w:hAnsi="Arial" w:cs="Arial"/>
+          <w:color w:val="000000" w:themeColor="text1"/>
+          <w:sz w:val="20"/>
+          <w:szCs w:val="20"/>
+        </w:rPr>
+      </w:pPr>
+    </w:p>
+    <w:p>
+      <w:pPr>
+        <w:pStyle w:val="BodyText2"/>
         <w:rPr>
           <w:rFonts w:ascii="Arial" w:hAnsi="Arial" w:cs="Arial"/>
           <w:b/>
@@ -983,7 +983,7 @@
     </w:p>
     <w:p>
       <w:pPr>
-        <w:pStyle w:val="Textkrper2"/>
+        <w:pStyle w:val="BodyText2"/>
         <w:tabs>
           <w:tab w:val="left" w:pos="753"/>
         </w:tabs>
@@ -1016,7 +1016,7 @@
     </w:p>
     <w:p>
       <w:pPr>
-        <w:pStyle w:val="Textkrper2"/>
+        <w:pStyle w:val="BodyText2"/>
         <w:spacing w:line="20" w:lineRule="atLeast"/>
         <w:rPr>
           <w:rFonts w:ascii="Arial" w:hAnsi="Arial" w:cs="Arial"/>
@@ -1046,7 +1046,7 @@
     </w:p>
     <w:p>
       <w:pPr>
-        <w:pStyle w:val="Textkrper2"/>
+        <w:pStyle w:val="BodyText2"/>
         <w:spacing w:line="20" w:lineRule="atLeast"/>
         <w:rPr>
           <w:rFonts w:ascii="Arial" w:hAnsi="Arial" w:cs="Arial"/>
@@ -1075,7 +1075,7 @@
     </w:p>
     <w:p>
       <w:pPr>
-        <w:pStyle w:val="Textkrper2"/>
+        <w:pStyle w:val="BodyText2"/>
         <w:rPr>
           <w:rFonts w:ascii="Arial" w:hAnsi="Arial" w:cs="Arial"/>
           <w:color w:val="000000" w:themeColor="text1"/>
@@ -1121,18 +1121,18 @@
     </w:p>
     <w:p>
       <w:pPr>
-        <w:pStyle w:val="Textkrper2"/>
-        <w:rPr>
-          <w:rFonts w:ascii="Arial" w:hAnsi="Arial" w:cs="Arial"/>
-          <w:color w:val="000000" w:themeColor="text1"/>
-          <w:sz w:val="20"/>
-          <w:szCs w:val="20"/>
-        </w:rPr>
-      </w:pPr>
-    </w:p>
-    <w:p>
-      <w:pPr>
-        <w:pStyle w:val="Textkrper2"/>
+        <w:pStyle w:val="BodyText2"/>
+        <w:rPr>
+          <w:rFonts w:ascii="Arial" w:hAnsi="Arial" w:cs="Arial"/>
+          <w:color w:val="000000" w:themeColor="text1"/>
+          <w:sz w:val="20"/>
+          <w:szCs w:val="20"/>
+        </w:rPr>
+      </w:pPr>
+    </w:p>
+    <w:p>
+      <w:pPr>
+        <w:pStyle w:val="BodyText2"/>
         <w:rPr>
           <w:rFonts w:ascii="Arial" w:hAnsi="Arial" w:cs="Arial"/>
           <w:color w:val="000000" w:themeColor="text1"/>
@@ -1152,29 +1152,29 @@
     </w:p>
     <w:p>
       <w:pPr>
-        <w:pStyle w:val="Textkrper2"/>
-        <w:rPr>
-          <w:rFonts w:ascii="Arial" w:hAnsi="Arial" w:cs="Arial"/>
-          <w:color w:val="000000" w:themeColor="text1"/>
-          <w:sz w:val="20"/>
-          <w:szCs w:val="20"/>
-        </w:rPr>
-      </w:pPr>
-    </w:p>
-    <w:p>
-      <w:pPr>
-        <w:pStyle w:val="Textkrper2"/>
-        <w:rPr>
-          <w:rFonts w:ascii="Arial" w:hAnsi="Arial" w:cs="Arial"/>
-          <w:color w:val="000000" w:themeColor="text1"/>
-          <w:sz w:val="20"/>
-          <w:szCs w:val="20"/>
-        </w:rPr>
-      </w:pPr>
-    </w:p>
-    <w:p>
-      <w:pPr>
-        <w:pStyle w:val="Textkrper2"/>
+        <w:pStyle w:val="BodyText2"/>
+        <w:rPr>
+          <w:rFonts w:ascii="Arial" w:hAnsi="Arial" w:cs="Arial"/>
+          <w:color w:val="000000" w:themeColor="text1"/>
+          <w:sz w:val="20"/>
+          <w:szCs w:val="20"/>
+        </w:rPr>
+      </w:pPr>
+    </w:p>
+    <w:p>
+      <w:pPr>
+        <w:pStyle w:val="BodyText2"/>
+        <w:rPr>
+          <w:rFonts w:ascii="Arial" w:hAnsi="Arial" w:cs="Arial"/>
+          <w:color w:val="000000" w:themeColor="text1"/>
+          <w:sz w:val="20"/>
+          <w:szCs w:val="20"/>
+        </w:rPr>
+      </w:pPr>
+    </w:p>
+    <w:p>
+      <w:pPr>
+        <w:pStyle w:val="BodyText2"/>
         <w:rPr>
           <w:rFonts w:ascii="Arial" w:hAnsi="Arial" w:cs="Arial"/>
           <w:b/>
@@ -1219,7 +1219,7 @@
     </w:p>
     <w:p>
       <w:pPr>
-        <w:pStyle w:val="Textkrper2"/>
+        <w:pStyle w:val="BodyText2"/>
         <w:tabs>
           <w:tab w:val="left" w:pos="753"/>
         </w:tabs>
@@ -1252,7 +1252,7 @@
     </w:p>
     <w:p>
       <w:pPr>
-        <w:pStyle w:val="Textkrper2"/>
+        <w:pStyle w:val="BodyText2"/>
         <w:spacing w:line="20" w:lineRule="atLeast"/>
         <w:rPr>
           <w:rFonts w:ascii="Arial" w:hAnsi="Arial" w:cs="Arial"/>
@@ -1282,7 +1282,7 @@
     </w:p>
     <w:p>
       <w:pPr>
-        <w:pStyle w:val="Textkrper2"/>
+        <w:pStyle w:val="BodyText2"/>
         <w:spacing w:line="20" w:lineRule="atLeast"/>
         <w:rPr>
           <w:rFonts w:ascii="Arial" w:hAnsi="Arial" w:cs="Arial"/>
@@ -1311,7 +1311,7 @@
     </w:p>
     <w:p>
       <w:pPr>
-        <w:pStyle w:val="Textkrper2"/>
+        <w:pStyle w:val="BodyText2"/>
         <w:rPr>
           <w:rFonts w:ascii="Arial" w:hAnsi="Arial" w:cs="Arial"/>
           <w:color w:val="000000" w:themeColor="text1"/>
@@ -1357,18 +1357,18 @@
     </w:p>
     <w:p>
       <w:pPr>
-        <w:pStyle w:val="Textkrper2"/>
-        <w:rPr>
-          <w:rFonts w:ascii="Arial" w:hAnsi="Arial" w:cs="Arial"/>
-          <w:color w:val="000000" w:themeColor="text1"/>
-          <w:sz w:val="20"/>
-          <w:szCs w:val="20"/>
-        </w:rPr>
-      </w:pPr>
-    </w:p>
-    <w:p>
-      <w:pPr>
-        <w:pStyle w:val="Textkrper2"/>
+        <w:pStyle w:val="BodyText2"/>
+        <w:rPr>
+          <w:rFonts w:ascii="Arial" w:hAnsi="Arial" w:cs="Arial"/>
+          <w:color w:val="000000" w:themeColor="text1"/>
+          <w:sz w:val="20"/>
+          <w:szCs w:val="20"/>
+        </w:rPr>
+      </w:pPr>
+    </w:p>
+    <w:p>
+      <w:pPr>
+        <w:pStyle w:val="BodyText2"/>
         <w:rPr>
           <w:rFonts w:ascii="Arial" w:hAnsi="Arial" w:cs="Arial"/>
           <w:color w:val="000000" w:themeColor="text1"/>
@@ -1388,18 +1388,18 @@
     </w:p>
     <w:p>
       <w:pPr>
-        <w:pStyle w:val="Textkrper2"/>
-        <w:rPr>
-          <w:rFonts w:ascii="Arial" w:hAnsi="Arial" w:cs="Arial"/>
-          <w:color w:val="000000" w:themeColor="text1"/>
-          <w:sz w:val="20"/>
-          <w:szCs w:val="20"/>
-        </w:rPr>
-      </w:pPr>
-    </w:p>
-    <w:p>
-      <w:pPr>
-        <w:pStyle w:val="Textkrper2"/>
+        <w:pStyle w:val="BodyText2"/>
+        <w:rPr>
+          <w:rFonts w:ascii="Arial" w:hAnsi="Arial" w:cs="Arial"/>
+          <w:color w:val="000000" w:themeColor="text1"/>
+          <w:sz w:val="20"/>
+          <w:szCs w:val="20"/>
+        </w:rPr>
+      </w:pPr>
+    </w:p>
+    <w:p>
+      <w:pPr>
+        <w:pStyle w:val="BodyText2"/>
         <w:rPr>
           <w:rFonts w:ascii="Arial" w:hAnsi="Arial" w:cs="Arial"/>
           <w:color w:val="000000" w:themeColor="text1"/>
@@ -1475,7 +1475,7 @@
 <w:hdr xmlns:wpc="http://schemas.microsoft.com/office/word/2010/wordprocessingCanvas" xmlns:cx="http://schemas.microsoft.com/office/drawing/2014/chartex" xmlns:cx1="http://schemas.microsoft.com/office/drawing/2015/9/8/chartex" xmlns:cx2="http://schemas.microsoft.com/office/drawing/2015/10/21/chartex" xmlns:cx3="http://schemas.microsoft.com/office/drawing/2016/5/9/chartex" xmlns:cx4="http://schemas.microsoft.com/office/drawing/2016/5/10/chartex" xmlns:cx5="http://schemas.microsoft.com/office/drawing/2016/5/11/chartex" xmlns:cx6="http://schemas.microsoft.com/office/drawing/2016/5/12/chartex" xmlns:cx7="http://schemas.microsoft.com/office/drawing/2016/5/13/chartex" xmlns:cx8="http://schemas.microsoft.com/office/drawing/2016/5/14/chartex" xmlns:mc="http://schemas.openxmlformats.org/markup-compatibility/2006" xmlns:aink="http://schemas.microsoft.com/office/drawing/2016/ink" xmlns:am3d="http://schemas.microsoft.com/office/drawing/2017/model3d" xmlns:o="urn:schemas-microsoft-com:office:office" xmlns:oel="http://schemas.microsoft.com/office/2019/extlst" xmlns:r="http://schemas.openxmlformats.org/officeDocument/2006/relationships" xmlns:m="http://schemas.openxmlformats.org/officeDocument/2006/math" xmlns:v="urn:schemas-microsoft-com:vml" xmlns:wp14="http://schemas.microsoft.com/office/word/2010/wordprocessingDrawing" xmlns:wp="http://schemas.openxmlformats.org/drawingml/2006/wordprocessingDrawing" xmlns:w10="urn:schemas-microsoft-com:office:word" xmlns:w="http://schemas.openxmlformats.org/wordprocessingml/2006/main" xmlns:w14="http://schemas.microsoft.com/office/word/2010/wordml" xmlns:w15="http://schemas.microsoft.com/office/word/2012/wordml" xmlns:w16cex="http://schemas.microsoft.com/office/word/2018/wordml/cex" xmlns:w16cid="http://schemas.microsoft.com/office/word/2016/wordml/cid" xmlns:w16="http://schemas.microsoft.com/office/word/2018/wordml" xmlns:w16du="http://schemas.microsoft.com/office/word/2023/wordml/word16du" xmlns:w16sdtdh="http://schemas.microsoft.com/office/word/2020/wordml/sdtdatahash" xmlns:w16sdtfl="http://schemas.microsoft.com/office/word/2024/wordml/sdtformatlock" xmlns:w16se="http://schemas.microsoft.com/office/word/2015/wordml/symex" xmlns:wpg="http://schemas.microsoft.com/office/word/2010/wordprocessingGroup" xmlns:wpi="http://schemas.microsoft.com/office/word/2010/wordprocessingInk" xmlns:wne="http://schemas.microsoft.com/office/word/2006/wordml" xmlns:wps="http://schemas.microsoft.com/office/word/2010/wordprocessingShape" mc:Ignorable="w14 w15 w16se w16cid w16 w16cex w16sdtdh w16sdtfl w16du wp14">
   <w:p>
     <w:pPr>
-      <w:pStyle w:val="Kopfzeile"/>
+      <w:pStyle w:val="Header"/>
       <w:tabs>
         <w:tab w:val="clear" w:pos="4536"/>
       </w:tabs>
@@ -1562,7 +1562,7 @@
   </w:p>
   <w:p>
     <w:pPr>
-      <w:pStyle w:val="Kopfzeile"/>
+      <w:pStyle w:val="Header"/>
       <w:tabs>
         <w:tab w:val="clear" w:pos="4536"/>
       </w:tabs>
@@ -4510,7 +4510,7 @@
     <w:lsdException w:name="Unresolved Mention" w:semiHidden="1" w:unhideWhenUsed="1"/>
     <w:lsdException w:name="Smart Link" w:semiHidden="1" w:unhideWhenUsed="1"/>
   </w:latentStyles>
-  <w:style w:type="paragraph" w:default="1" w:styleId="Standard">
+  <w:style w:type="paragraph" w:default="1" w:styleId="Normal">
     <w:name w:val="Normal"/>
     <w:qFormat/>
     <w:rsid w:val="00BE28CB"/>
@@ -4521,13 +4521,13 @@
       <w:lang w:eastAsia="en-US"/>
     </w:rPr>
   </w:style>
-  <w:style w:type="character" w:default="1" w:styleId="Absatz-Standardschriftart">
+  <w:style w:type="character" w:default="1" w:styleId="DefaultParagraphFont">
     <w:name w:val="Default Paragraph Font"/>
     <w:uiPriority w:val="1"/>
     <w:semiHidden/>
     <w:unhideWhenUsed/>
   </w:style>
-  <w:style w:type="table" w:default="1" w:styleId="NormaleTabelle">
+  <w:style w:type="table" w:default="1" w:styleId="TableNormal">
     <w:name w:val="Normal Table"/>
     <w:uiPriority w:val="99"/>
     <w:semiHidden/>
@@ -4542,16 +4542,16 @@
       </w:tblCellMar>
     </w:tblPr>
   </w:style>
-  <w:style w:type="numbering" w:default="1" w:styleId="KeineListe">
+  <w:style w:type="numbering" w:default="1" w:styleId="NoList">
     <w:name w:val="No List"/>
     <w:uiPriority w:val="99"/>
     <w:semiHidden/>
     <w:unhideWhenUsed/>
   </w:style>
-  <w:style w:type="paragraph" w:styleId="Kopfzeile">
+  <w:style w:type="paragraph" w:styleId="Header">
     <w:name w:val="header"/>
-    <w:basedOn w:val="Standard"/>
-    <w:link w:val="KopfzeileZchn"/>
+    <w:basedOn w:val="Normal"/>
+    <w:link w:val="HeaderChar"/>
     <w:uiPriority w:val="99"/>
     <w:rsid w:val="00B963EF"/>
     <w:pPr>
@@ -4562,10 +4562,10 @@
       <w:spacing w:after="0" w:line="240" w:lineRule="auto"/>
     </w:pPr>
   </w:style>
-  <w:style w:type="character" w:customStyle="1" w:styleId="KopfzeileZchn">
-    <w:name w:val="Kopfzeile Zchn"/>
-    <w:basedOn w:val="Absatz-Standardschriftart"/>
-    <w:link w:val="Kopfzeile"/>
+  <w:style w:type="character" w:customStyle="1" w:styleId="HeaderChar">
+    <w:name w:val="Header Char"/>
+    <w:basedOn w:val="DefaultParagraphFont"/>
+    <w:link w:val="Header"/>
     <w:uiPriority w:val="99"/>
     <w:locked/>
     <w:rsid w:val="00B963EF"/>
@@ -4573,10 +4573,10 @@
       <w:rFonts w:cs="Times New Roman"/>
     </w:rPr>
   </w:style>
-  <w:style w:type="paragraph" w:styleId="Fuzeile">
+  <w:style w:type="paragraph" w:styleId="Footer">
     <w:name w:val="footer"/>
-    <w:basedOn w:val="Standard"/>
-    <w:link w:val="FuzeileZchn"/>
+    <w:basedOn w:val="Normal"/>
+    <w:link w:val="FooterChar"/>
     <w:uiPriority w:val="99"/>
     <w:rsid w:val="00B963EF"/>
     <w:pPr>
@@ -4587,10 +4587,10 @@
       <w:spacing w:after="0" w:line="240" w:lineRule="auto"/>
     </w:pPr>
   </w:style>
-  <w:style w:type="character" w:customStyle="1" w:styleId="FuzeileZchn">
-    <w:name w:val="Fußzeile Zchn"/>
-    <w:basedOn w:val="Absatz-Standardschriftart"/>
-    <w:link w:val="Fuzeile"/>
+  <w:style w:type="character" w:customStyle="1" w:styleId="FooterChar">
+    <w:name w:val="Footer Char"/>
+    <w:basedOn w:val="DefaultParagraphFont"/>
+    <w:link w:val="Footer"/>
     <w:uiPriority w:val="99"/>
     <w:locked/>
     <w:rsid w:val="00B963EF"/>
@@ -4598,9 +4598,9 @@
       <w:rFonts w:cs="Times New Roman"/>
     </w:rPr>
   </w:style>
-  <w:style w:type="table" w:styleId="Tabellenraster">
+  <w:style w:type="table" w:styleId="TableGrid">
     <w:name w:val="Table Grid"/>
-    <w:basedOn w:val="NormaleTabelle"/>
+    <w:basedOn w:val="TableNormal"/>
     <w:uiPriority w:val="99"/>
     <w:rsid w:val="00B963EF"/>
     <w:rPr>
@@ -4618,7 +4618,7 @@
       </w:tblBorders>
     </w:tblPr>
   </w:style>
-  <w:style w:type="paragraph" w:styleId="KeinLeerraum">
+  <w:style w:type="paragraph" w:styleId="NoSpacing">
     <w:name w:val="No Spacing"/>
     <w:uiPriority w:val="99"/>
     <w:qFormat/>
@@ -4627,10 +4627,10 @@
       <w:noProof/>
     </w:rPr>
   </w:style>
-  <w:style w:type="paragraph" w:styleId="Sprechblasentext">
+  <w:style w:type="paragraph" w:styleId="BalloonText">
     <w:name w:val="Balloon Text"/>
-    <w:basedOn w:val="Standard"/>
-    <w:link w:val="SprechblasentextZchn"/>
+    <w:basedOn w:val="Normal"/>
+    <w:link w:val="BalloonTextChar"/>
     <w:uiPriority w:val="99"/>
     <w:semiHidden/>
     <w:rsid w:val="00C84C78"/>
@@ -4643,10 +4643,10 @@
       <w:szCs w:val="16"/>
     </w:rPr>
   </w:style>
-  <w:style w:type="character" w:customStyle="1" w:styleId="SprechblasentextZchn">
-    <w:name w:val="Sprechblasentext Zchn"/>
-    <w:basedOn w:val="Absatz-Standardschriftart"/>
-    <w:link w:val="Sprechblasentext"/>
+  <w:style w:type="character" w:customStyle="1" w:styleId="BalloonTextChar">
+    <w:name w:val="Balloon Text Char"/>
+    <w:basedOn w:val="DefaultParagraphFont"/>
+    <w:link w:val="BalloonText"/>
     <w:uiPriority w:val="99"/>
     <w:semiHidden/>
     <w:locked/>
@@ -4657,9 +4657,9 @@
       <w:szCs w:val="16"/>
     </w:rPr>
   </w:style>
-  <w:style w:type="character" w:styleId="Platzhaltertext">
+  <w:style w:type="character" w:styleId="PlaceholderText">
     <w:name w:val="Placeholder Text"/>
-    <w:basedOn w:val="Absatz-Standardschriftart"/>
+    <w:basedOn w:val="DefaultParagraphFont"/>
     <w:uiPriority w:val="99"/>
     <w:semiHidden/>
     <w:rsid w:val="00DB2D71"/>
@@ -4670,7 +4670,7 @@
   </w:style>
   <w:style w:type="character" w:styleId="Hyperlink">
     <w:name w:val="Hyperlink"/>
-    <w:basedOn w:val="Absatz-Standardschriftart"/>
+    <w:basedOn w:val="DefaultParagraphFont"/>
     <w:uiPriority w:val="99"/>
     <w:rsid w:val="00FF4BC5"/>
     <w:rPr>
@@ -4679,9 +4679,9 @@
       <w:u w:val="single"/>
     </w:rPr>
   </w:style>
-  <w:style w:type="paragraph" w:styleId="Listenabsatz">
+  <w:style w:type="paragraph" w:styleId="ListParagraph">
     <w:name w:val="List Paragraph"/>
-    <w:basedOn w:val="Standard"/>
+    <w:basedOn w:val="Normal"/>
     <w:uiPriority w:val="99"/>
     <w:qFormat/>
     <w:rsid w:val="00D719E3"/>
@@ -4690,7 +4690,7 @@
       <w:contextualSpacing/>
     </w:pPr>
   </w:style>
-  <w:style w:type="paragraph" w:styleId="berarbeitung">
+  <w:style w:type="paragraph" w:styleId="Revision">
     <w:name w:val="Revision"/>
     <w:hidden/>
     <w:uiPriority w:val="99"/>
@@ -4700,10 +4700,10 @@
       <w:lang w:eastAsia="en-US"/>
     </w:rPr>
   </w:style>
-  <w:style w:type="paragraph" w:styleId="HTMLAdresse">
+  <w:style w:type="paragraph" w:styleId="HTMLAddress">
     <w:name w:val="HTML Address"/>
-    <w:basedOn w:val="Standard"/>
-    <w:link w:val="HTMLAdresseZchn"/>
+    <w:basedOn w:val="Normal"/>
+    <w:link w:val="HTMLAddressChar"/>
     <w:uiPriority w:val="99"/>
     <w:semiHidden/>
     <w:unhideWhenUsed/>
@@ -4720,10 +4720,10 @@
       <w:lang w:eastAsia="de-DE"/>
     </w:rPr>
   </w:style>
-  <w:style w:type="character" w:customStyle="1" w:styleId="HTMLAdresseZchn">
-    <w:name w:val="HTML Adresse Zchn"/>
-    <w:basedOn w:val="Absatz-Standardschriftart"/>
-    <w:link w:val="HTMLAdresse"/>
+  <w:style w:type="character" w:customStyle="1" w:styleId="HTMLAddressChar">
+    <w:name w:val="HTML Address Char"/>
+    <w:basedOn w:val="DefaultParagraphFont"/>
+    <w:link w:val="HTMLAddress"/>
     <w:uiPriority w:val="99"/>
     <w:semiHidden/>
     <w:rsid w:val="00DA2938"/>
@@ -4735,9 +4735,9 @@
       <w:szCs w:val="20"/>
     </w:rPr>
   </w:style>
-  <w:style w:type="paragraph" w:styleId="StandardWeb">
+  <w:style w:type="paragraph" w:styleId="NormalWeb">
     <w:name w:val="Normal (Web)"/>
-    <w:basedOn w:val="Standard"/>
+    <w:basedOn w:val="Normal"/>
     <w:uiPriority w:val="99"/>
     <w:semiHidden/>
     <w:unhideWhenUsed/>
@@ -4752,10 +4752,10 @@
       <w:lang w:eastAsia="de-DE"/>
     </w:rPr>
   </w:style>
-  <w:style w:type="paragraph" w:styleId="Textkrper2">
+  <w:style w:type="paragraph" w:styleId="BodyText2">
     <w:name w:val="Body Text 2"/>
-    <w:basedOn w:val="Standard"/>
-    <w:link w:val="Textkrper2Zchn"/>
+    <w:basedOn w:val="Normal"/>
+    <w:link w:val="BodyText2Char"/>
     <w:rsid w:val="00792090"/>
     <w:pPr>
       <w:spacing w:after="0" w:line="240" w:lineRule="auto"/>
@@ -4767,10 +4767,10 @@
       <w:lang w:eastAsia="ja-JP"/>
     </w:rPr>
   </w:style>
-  <w:style w:type="character" w:customStyle="1" w:styleId="Textkrper2Zchn">
-    <w:name w:val="Textkörper 2 Zchn"/>
-    <w:basedOn w:val="Absatz-Standardschriftart"/>
-    <w:link w:val="Textkrper2"/>
+  <w:style w:type="character" w:customStyle="1" w:styleId="BodyText2Char">
+    <w:name w:val="Body Text 2 Char"/>
+    <w:basedOn w:val="DefaultParagraphFont"/>
+    <w:link w:val="BodyText2"/>
     <w:rsid w:val="00792090"/>
     <w:rPr>
       <w:rFonts w:ascii="Tahoma" w:eastAsia="MS Mincho" w:hAnsi="Tahoma" w:cs="Tahoma"/>
@@ -5066,15 +5066,6 @@
 </file>
 
 <file path=customXml/item1.xml><?xml version="1.0" encoding="utf-8"?>
-<?mso-contentType ?>
-<FormTemplates xmlns="http://schemas.microsoft.com/sharepoint/v3/contenttype/forms">
-  <Display>DocumentLibraryForm</Display>
-  <Edit>DocumentLibraryForm</Edit>
-  <New>DocumentLibraryForm</New>
-</FormTemplates>
-</file>
-
-<file path=customXml/item2.xml><?xml version="1.0" encoding="utf-8"?>
 <ct:contentTypeSchema xmlns:ct="http://schemas.microsoft.com/office/2006/metadata/contentType" xmlns:ma="http://schemas.microsoft.com/office/2006/metadata/properties/metaAttributes" ct:_="" ma:_="" ma:contentTypeName="Dokument" ma:contentTypeID="0x010100E52D44948651124DA370126DCC3C30DE" ma:contentTypeVersion="15" ma:contentTypeDescription="Ein neues Dokument erstellen." ma:contentTypeScope="" ma:versionID="cf988dacb5a583b08dddebc900c1e816">
   <xsd:schema xmlns:xsd="http://www.w3.org/2001/XMLSchema" xmlns:xs="http://www.w3.org/2001/XMLSchema" xmlns:p="http://schemas.microsoft.com/office/2006/metadata/properties" xmlns:ns2="b9987dc6-325a-42cf-add5-6a4ebd733ffe" xmlns:ns3="f6fd8445-5b0d-4f7c-85e4-1cf356d7fcbf" targetNamespace="http://schemas.microsoft.com/office/2006/metadata/properties" ma:root="true" ma:fieldsID="f7a3ee268e62bd000fb682934db342a5" ns2:_="" ns3:_="">
     <xsd:import namespace="b9987dc6-325a-42cf-add5-6a4ebd733ffe"/>
@@ -5309,11 +5300,11 @@
 </ct:contentTypeSchema>
 </file>
 
-<file path=customXml/item3.xml><?xml version="1.0" encoding="utf-8"?>
+<file path=customXml/item2.xml><?xml version="1.0" encoding="utf-8"?>
 <b:Sources xmlns:b="http://schemas.openxmlformats.org/officeDocument/2006/bibliography" xmlns="http://schemas.openxmlformats.org/officeDocument/2006/bibliography" SelectedStyle="/APA.XSL" StyleName="APA"/>
 </file>
 
-<file path=customXml/item4.xml><?xml version="1.0" encoding="utf-8"?>
+<file path=customXml/item3.xml><?xml version="1.0" encoding="utf-8"?>
 <p:properties xmlns:p="http://schemas.microsoft.com/office/2006/metadata/properties" xmlns:xsi="http://www.w3.org/2001/XMLSchema-instance" xmlns:pc="http://schemas.microsoft.com/office/infopath/2007/PartnerControls">
   <documentManagement>
     <lcf76f155ced4ddcb4097134ff3c332f xmlns="b9987dc6-325a-42cf-add5-6a4ebd733ffe">
@@ -5324,19 +5315,35 @@
 </p:properties>
 </file>
 
+<file path=customXml/item4.xml><?xml version="1.0" encoding="utf-8"?>
+<?mso-contentType ?>
+<FormTemplates xmlns="http://schemas.microsoft.com/sharepoint/v3/contenttype/forms">
+  <Display>DocumentLibraryForm</Display>
+  <Edit>DocumentLibraryForm</Edit>
+  <New>DocumentLibraryForm</New>
+</FormTemplates>
+</file>
+
 <file path=customXml/itemProps1.xml><?xml version="1.0" encoding="utf-8"?>
-<ds:datastoreItem xmlns:ds="http://schemas.openxmlformats.org/officeDocument/2006/customXml" ds:itemID="{F74C08EB-E4C1-4679-BAFC-986F15CC02BC}">
+<ds:datastoreItem xmlns:ds="http://schemas.openxmlformats.org/officeDocument/2006/customXml" ds:itemID="{EC2E6A1D-C2A2-499C-AAD6-5DF01BDA8E22}">
   <ds:schemaRefs>
-    <ds:schemaRef ds:uri="http://schemas.microsoft.com/sharepoint/v3/contenttype/forms"/>
+    <ds:schemaRef ds:uri="http://schemas.microsoft.com/office/2006/metadata/contentType"/>
+    <ds:schemaRef ds:uri="http://schemas.microsoft.com/office/2006/metadata/properties/metaAttributes"/>
+    <ds:schemaRef ds:uri="http://www.w3.org/2001/XMLSchema"/>
+    <ds:schemaRef ds:uri="http://schemas.microsoft.com/office/2006/metadata/properties"/>
+    <ds:schemaRef ds:uri="b9987dc6-325a-42cf-add5-6a4ebd733ffe"/>
+    <ds:schemaRef ds:uri="f6fd8445-5b0d-4f7c-85e4-1cf356d7fcbf"/>
+    <ds:schemaRef ds:uri="http://schemas.microsoft.com/office/2006/documentManagement/types"/>
+    <ds:schemaRef ds:uri="http://schemas.microsoft.com/office/infopath/2007/PartnerControls"/>
+    <ds:schemaRef ds:uri="http://schemas.openxmlformats.org/package/2006/metadata/core-properties"/>
+    <ds:schemaRef ds:uri="http://purl.org/dc/elements/1.1/"/>
+    <ds:schemaRef ds:uri="http://purl.org/dc/terms/"/>
+    <ds:schemaRef ds:uri="http://schemas.microsoft.com/internal/obd"/>
   </ds:schemaRefs>
 </ds:datastoreItem>
 </file>
 
 <file path=customXml/itemProps2.xml><?xml version="1.0" encoding="utf-8"?>
-<ds:datastoreItem xmlns:ds="http://schemas.openxmlformats.org/officeDocument/2006/customXml" ds:itemID="{EC2E6A1D-C2A2-499C-AAD6-5DF01BDA8E22}"/>
-</file>
-
-<file path=customXml/itemProps3.xml><?xml version="1.0" encoding="utf-8"?>
 <ds:datastoreItem xmlns:ds="http://schemas.openxmlformats.org/officeDocument/2006/customXml" ds:itemID="{5D7FDEFB-A59B-5242-8494-87A15F7BB08E}">
   <ds:schemaRefs>
     <ds:schemaRef ds:uri="http://schemas.openxmlformats.org/officeDocument/2006/bibliography"/>
@@ -5344,7 +5351,7 @@
 </ds:datastoreItem>
 </file>
 
-<file path=customXml/itemProps4.xml><?xml version="1.0" encoding="utf-8"?>
+<file path=customXml/itemProps3.xml><?xml version="1.0" encoding="utf-8"?>
 <ds:datastoreItem xmlns:ds="http://schemas.openxmlformats.org/officeDocument/2006/customXml" ds:itemID="{307B54A2-BDEC-4E7A-B7E0-B14A30B4A632}">
   <ds:schemaRefs>
     <ds:schemaRef ds:uri="http://schemas.microsoft.com/office/2006/metadata/properties"/>
@@ -5353,4 +5360,12 @@
     <ds:schemaRef ds:uri="f6fd8445-5b0d-4f7c-85e4-1cf356d7fcbf"/>
   </ds:schemaRefs>
 </ds:datastoreItem>
+</file>
+
+<file path=customXml/itemProps4.xml><?xml version="1.0" encoding="utf-8"?>
+<ds:datastoreItem xmlns:ds="http://schemas.openxmlformats.org/officeDocument/2006/customXml" ds:itemID="{F74C08EB-E4C1-4679-BAFC-986F15CC02BC}">
+  <ds:schemaRefs>
+    <ds:schemaRef ds:uri="http://schemas.microsoft.com/sharepoint/v3/contenttype/forms"/>
+  </ds:schemaRefs>
+</ds:datastoreItem>
 </file>
</xml_diff>